<commit_message>
Correct band numbers to the full-data measurement
The envelope-failure example was quoted from a partial run (HKUST-1 9.4% vs
UMCM-1 15.4%). Running every framework through the hold-out test gives a
sharper and correct case: ZIF-8, a genuine band member, scores 0.0% while
UMCM-1, a non-member, scores 44.7%.

Also: noise floor stated as the computed 0.105 (was 0.106) everywhere.
Updated in README, band_page.js, index.html, concept doc 4 (md + docx),
and code_sources.js.
</commit_message>
<xml_diff>
--- a/5_concepts/04_Network_and_Multifractal_Analysis.docx
+++ b/5_concepts/04_Network_and_Multifractal_Analysis.docx
@@ -9170,7 +9170,7 @@
                 <w:sz w:val="19"/>
                 <w:szCs w:val="19"/>
               </w:rPr>
-              <w:t xml:space="preserve"> Held out and re-tested, every framework is classified correctly</w:t>
+              <w:t xml:space="preserve"> Held out and re-tested, all 8 frameworks are classified correctly</w:t>
             </w:r>
           </w:p>
         </w:tc>
@@ -9275,7 +9275,7 @@
                 <w:sz w:val="19"/>
                 <w:szCs w:val="19"/>
               </w:rPr>
-              <w:t xml:space="preserve"> Held out, HKUST-1 (member) scores 9.4%; UMCM-1 (non-member) scores 15.4%</w:t>
+              <w:t xml:space="preserve"> Held out, ZIF-8 (member) scores 0.0%; UMCM-1 (non-member) scores 44.7%</w:t>
             </w:r>
           </w:p>
         </w:tc>
@@ -9297,7 +9297,7 @@
           <w:sz w:val="21"/>
           <w:szCs w:val="21"/>
         </w:rPr>
-        <w:t xml:space="preserve">The envelope fails for a reason that is visible once the curves are plotted: the two narrow spectra are </w:t>
+        <w:t xml:space="preserve">The failure is stark rather than marginal — a non-member scores more than forty points higher than a member. The reason is visible once the curves are plotted: the two narrow spectra are </w:t>
       </w:r>
       <w:r>
         <w:rPr>
@@ -9438,7 +9438,7 @@
           <w:sz w:val="21"/>
           <w:szCs w:val="21"/>
         </w:rPr>
-        <w:t xml:space="preserve">0.46 — roughly four times the 0.106 noise floor</w:t>
+        <w:t xml:space="preserve">0.46 — roughly four times the 0.105 noise floor</w:t>
       </w:r>
       <w:r>
         <w:rPr>
@@ -9678,7 +9678,7 @@
           <w:sz w:val="20"/>
           <w:szCs w:val="20"/>
         </w:rPr>
-        <w:t xml:space="preserve">That control sets a noise floor of 0.106</w:t>
+        <w:t xml:space="preserve">That control sets a noise floor of 0.105</w:t>
       </w:r>
       <w:r>
         <w:rPr>

</xml_diff>